<commit_message>
Apply footer credit to all pages and enlarge WhatsApp icon
</commit_message>
<xml_diff>
--- a/DATOS PARA PAGINA WEB.docx
+++ b/DATOS PARA PAGINA WEB.docx
@@ -28,7 +28,10 @@
     <w:p/>
     <w:p>
       <w:r>
-        <w:t xml:space="preserve">Empresas en la que trabajo </w:t>
+        <w:t>Empresas clientes</w:t>
+      </w:r>
+      <w:r>
+        <w:t xml:space="preserve"> </w:t>
       </w:r>
     </w:p>
     <w:p>
@@ -78,31 +81,6 @@
         </w:r>
       </w:hyperlink>
     </w:p>
-    <w:p>
-      <w:bookmarkStart w:id="0" w:name="_GoBack"/>
-      <w:bookmarkEnd w:id="0"/>
-    </w:p>
-    <w:p/>
-    <w:p>
-      <w:proofErr w:type="spellStart"/>
-      <w:r>
-        <w:t>Pagina</w:t>
-      </w:r>
-      <w:proofErr w:type="spellEnd"/>
-      <w:r>
-        <w:t xml:space="preserve"> de Referencia de contenidos que es competencia</w:t>
-      </w:r>
-    </w:p>
-    <w:p>
-      <w:hyperlink r:id="rId5" w:history="1">
-        <w:r>
-          <w:rPr>
-            <w:rStyle w:val="Hipervnculo"/>
-          </w:rPr>
-          <w:t>https://coffesunseed.cl/</w:t>
-        </w:r>
-      </w:hyperlink>
-    </w:p>
     <w:p/>
     <w:p/>
     <w:p>
@@ -112,11 +90,60 @@
       </w:r>
       <w:proofErr w:type="spellEnd"/>
       <w:r>
+        <w:t xml:space="preserve"> de Referencia de contenidos que es competencia</w:t>
+      </w:r>
+    </w:p>
+    <w:bookmarkStart w:id="0" w:name="_GoBack"/>
+    <w:p>
+      <w:r>
+        <w:fldChar w:fldCharType="begin"/>
+      </w:r>
+      <w:r>
+        <w:instrText xml:space="preserve"> HYPERLINK "https://coffesunseed.cl/" </w:instrText>
+      </w:r>
+      <w:r>
+        <w:fldChar w:fldCharType="separate"/>
+      </w:r>
+      <w:r>
+        <w:rPr>
+          <w:rStyle w:val="Hipervnculo"/>
+        </w:rPr>
+        <w:t>https://coffesunseed.</w:t>
+      </w:r>
+      <w:r>
+        <w:rPr>
+          <w:rStyle w:val="Hipervnculo"/>
+        </w:rPr>
+        <w:t>c</w:t>
+      </w:r>
+      <w:r>
+        <w:rPr>
+          <w:rStyle w:val="Hipervnculo"/>
+        </w:rPr>
+        <w:t>l/</w:t>
+      </w:r>
+      <w:r>
+        <w:rPr>
+          <w:rStyle w:val="Hipervnculo"/>
+        </w:rPr>
+        <w:fldChar w:fldCharType="end"/>
+      </w:r>
+    </w:p>
+    <w:bookmarkEnd w:id="0"/>
+    <w:p/>
+    <w:p/>
+    <w:p>
+      <w:proofErr w:type="spellStart"/>
+      <w:r>
+        <w:t>Pagina</w:t>
+      </w:r>
+      <w:proofErr w:type="spellEnd"/>
+      <w:r>
         <w:t xml:space="preserve"> de referencia para sacar los efectos de la web:</w:t>
       </w:r>
     </w:p>
     <w:p>
-      <w:hyperlink r:id="rId6" w:history="1">
+      <w:hyperlink r:id="rId5" w:history="1">
         <w:r>
           <w:rPr>
             <w:rStyle w:val="Hipervnculo"/>
@@ -568,6 +595,18 @@
       <w:u w:val="single"/>
     </w:rPr>
   </w:style>
+  <w:style w:type="character" w:styleId="Hipervnculovisitado">
+    <w:name w:val="FollowedHyperlink"/>
+    <w:basedOn w:val="Fuentedeprrafopredeter"/>
+    <w:uiPriority w:val="99"/>
+    <w:semiHidden/>
+    <w:unhideWhenUsed/>
+    <w:rsid w:val="001B6975"/>
+    <w:rPr>
+      <w:color w:val="954F72" w:themeColor="followedHyperlink"/>
+      <w:u w:val="single"/>
+    </w:rPr>
+  </w:style>
 </w:styles>
 </file>
 

</xml_diff>